<commit_message>
Report: fix table layout and Word schema order
Co-Authored-By: Claude Opus 5.5 <noreply@anthropic.com>
Claude-Session: https://claude.ai/code/session_01CVjPEta3SBjYaAX7UNbPBU
</commit_message>
<xml_diff>
--- a/report/Report_Consumer_Choice_baseline.docx
+++ b/report/Report_Consumer_Choice_baseline.docx
@@ -135,11 +135,10 @@
     </w:p>
     <w:tbl>
       <w:tblPr>
+        <w:tblW w:w="6917" w:type="dxa"/>
         <w:jc w:val="center"/>
         <w:tblLayout w:type="fixed"/>
         <w:tblLook w:firstColumn="1" w:firstRow="1" w:lastColumn="0" w:lastRow="0" w:noHBand="0" w:noVBand="1" w:val="04A0"/>
-        <w:tblLayout w:type="fixed"/>
-        <w:tblW w:w="6917" w:type="dxa"/>
       </w:tblPr>
       <w:tblGrid>
         <w:gridCol w:w="1701"/>
@@ -568,11 +567,10 @@
     </w:p>
     <w:tbl>
       <w:tblPr>
+        <w:tblW w:w="6917" w:type="dxa"/>
         <w:jc w:val="center"/>
         <w:tblLayout w:type="fixed"/>
         <w:tblLook w:firstColumn="1" w:firstRow="1" w:lastColumn="0" w:lastRow="0" w:noHBand="0" w:noVBand="1" w:val="04A0"/>
-        <w:tblLayout w:type="fixed"/>
-        <w:tblW w:w="6917" w:type="dxa"/>
       </w:tblPr>
       <w:tblGrid>
         <w:gridCol w:w="1814"/>
@@ -2179,11 +2177,10 @@
     </w:p>
     <w:tbl>
       <w:tblPr>
+        <w:tblW w:w="6917" w:type="dxa"/>
         <w:jc w:val="center"/>
         <w:tblLayout w:type="fixed"/>
         <w:tblLook w:firstColumn="1" w:firstRow="1" w:lastColumn="0" w:lastRow="0" w:noHBand="0" w:noVBand="1" w:val="04A0"/>
-        <w:tblLayout w:type="fixed"/>
-        <w:tblW w:w="6917" w:type="dxa"/>
       </w:tblPr>
       <w:tblGrid>
         <w:gridCol w:w="1587"/>
@@ -2830,11 +2827,10 @@
     </w:p>
     <w:tbl>
       <w:tblPr>
+        <w:tblW w:w="6917" w:type="dxa"/>
         <w:jc w:val="center"/>
         <w:tblLayout w:type="fixed"/>
         <w:tblLook w:firstColumn="1" w:firstRow="1" w:lastColumn="0" w:lastRow="0" w:noHBand="0" w:noVBand="1" w:val="04A0"/>
-        <w:tblLayout w:type="fixed"/>
-        <w:tblW w:w="6917" w:type="dxa"/>
       </w:tblPr>
       <w:tblGrid>
         <w:gridCol w:w="1871"/>
@@ -3838,11 +3834,10 @@
     </w:p>
     <w:tbl>
       <w:tblPr>
+        <w:tblW w:w="6917" w:type="dxa"/>
         <w:jc w:val="center"/>
         <w:tblLayout w:type="fixed"/>
         <w:tblLook w:firstColumn="1" w:firstRow="1" w:lastColumn="0" w:lastRow="0" w:noHBand="0" w:noVBand="1" w:val="04A0"/>
-        <w:tblLayout w:type="fixed"/>
-        <w:tblW w:w="6917" w:type="dxa"/>
       </w:tblPr>
       <w:tblGrid>
         <w:gridCol w:w="1531"/>
@@ -4246,11 +4241,10 @@
     </w:p>
     <w:tbl>
       <w:tblPr>
+        <w:tblW w:w="6917" w:type="dxa"/>
         <w:jc w:val="center"/>
         <w:tblLayout w:type="fixed"/>
         <w:tblLook w:firstColumn="1" w:firstRow="1" w:lastColumn="0" w:lastRow="0" w:noHBand="0" w:noVBand="1" w:val="04A0"/>
-        <w:tblLayout w:type="fixed"/>
-        <w:tblW w:w="6917" w:type="dxa"/>
       </w:tblPr>
       <w:tblGrid>
         <w:gridCol w:w="1247"/>
@@ -4926,11 +4920,10 @@
     </w:p>
     <w:tbl>
       <w:tblPr>
+        <w:tblW w:w="6917" w:type="dxa"/>
         <w:jc w:val="center"/>
         <w:tblLayout w:type="fixed"/>
         <w:tblLook w:firstColumn="1" w:firstRow="1" w:lastColumn="0" w:lastRow="0" w:noHBand="0" w:noVBand="1" w:val="04A0"/>
-        <w:tblLayout w:type="fixed"/>
-        <w:tblW w:w="6917" w:type="dxa"/>
       </w:tblPr>
       <w:tblGrid>
         <w:gridCol w:w="1701"/>
@@ -5680,11 +5673,10 @@
     </w:p>
     <w:tbl>
       <w:tblPr>
+        <w:tblW w:w="6917" w:type="dxa"/>
         <w:jc w:val="center"/>
         <w:tblLayout w:type="fixed"/>
         <w:tblLook w:firstColumn="1" w:firstRow="1" w:lastColumn="0" w:lastRow="0" w:noHBand="0" w:noVBand="1" w:val="04A0"/>
-        <w:tblLayout w:type="fixed"/>
-        <w:tblW w:w="6917" w:type="dxa"/>
       </w:tblPr>
       <w:tblGrid>
         <w:gridCol w:w="794"/>
@@ -7007,11 +6999,10 @@
     </w:p>
     <w:tbl>
       <w:tblPr>
+        <w:tblW w:w="6917" w:type="dxa"/>
         <w:jc w:val="center"/>
         <w:tblLayout w:type="fixed"/>
         <w:tblLook w:firstColumn="1" w:firstRow="1" w:lastColumn="0" w:lastRow="0" w:noHBand="0" w:noVBand="1" w:val="04A0"/>
-        <w:tblLayout w:type="fixed"/>
-        <w:tblW w:w="6917" w:type="dxa"/>
       </w:tblPr>
       <w:tblGrid>
         <w:gridCol w:w="1474"/>
@@ -8391,11 +8382,10 @@
     </w:p>
     <w:tbl>
       <w:tblPr>
+        <w:tblW w:w="6917" w:type="dxa"/>
         <w:jc w:val="center"/>
         <w:tblLayout w:type="fixed"/>
         <w:tblLook w:firstColumn="1" w:firstRow="1" w:lastColumn="0" w:lastRow="0" w:noHBand="0" w:noVBand="1" w:val="04A0"/>
-        <w:tblLayout w:type="fixed"/>
-        <w:tblW w:w="6917" w:type="dxa"/>
       </w:tblPr>
       <w:tblGrid>
         <w:gridCol w:w="1474"/>
@@ -9339,11 +9329,10 @@
     </w:p>
     <w:tbl>
       <w:tblPr>
+        <w:tblW w:w="6917" w:type="dxa"/>
         <w:jc w:val="center"/>
         <w:tblLayout w:type="fixed"/>
         <w:tblLook w:firstColumn="1" w:firstRow="1" w:lastColumn="0" w:lastRow="0" w:noHBand="0" w:noVBand="1" w:val="04A0"/>
-        <w:tblLayout w:type="fixed"/>
-        <w:tblW w:w="6917" w:type="dxa"/>
       </w:tblPr>
       <w:tblGrid>
         <w:gridCol w:w="1474"/>
@@ -10091,11 +10080,10 @@
     </w:p>
     <w:tbl>
       <w:tblPr>
+        <w:tblW w:w="6917" w:type="dxa"/>
         <w:jc w:val="center"/>
         <w:tblLayout w:type="fixed"/>
         <w:tblLook w:firstColumn="1" w:firstRow="1" w:lastColumn="0" w:lastRow="0" w:noHBand="0" w:noVBand="1" w:val="04A0"/>
-        <w:tblLayout w:type="fixed"/>
-        <w:tblW w:w="6917" w:type="dxa"/>
       </w:tblPr>
       <w:tblGrid>
         <w:gridCol w:w="2268"/>
@@ -10751,8 +10739,8 @@
     </w:lvl>
     <w:lvl w:ilvl="3">
       <w:start w:val="0"/>
+      <w:numFmt w:val="decimal"/>
       <w:pStyle w:val="Heading4"/>
-      <w:numFmt w:val="decimal"/>
       <w:lvlText w:val="%4"/>
       <w:lvlJc w:val="start"/>
       <w:pPr>
@@ -10767,8 +10755,8 @@
     </w:lvl>
     <w:lvl w:ilvl="4">
       <w:start w:val="0"/>
+      <w:numFmt w:val="decimal"/>
       <w:pStyle w:val="Heading5"/>
-      <w:numFmt w:val="decimal"/>
       <w:lvlText w:val="%5"/>
       <w:lvlJc w:val="start"/>
       <w:pPr>
@@ -10783,8 +10771,8 @@
     </w:lvl>
     <w:lvl w:ilvl="5">
       <w:start w:val="0"/>
+      <w:numFmt w:val="decimal"/>
       <w:pStyle w:val="Heading6"/>
-      <w:numFmt w:val="decimal"/>
       <w:lvlText w:val="%6"/>
       <w:lvlJc w:val="start"/>
       <w:pPr>
@@ -10799,8 +10787,8 @@
     </w:lvl>
     <w:lvl w:ilvl="6">
       <w:start w:val="0"/>
+      <w:numFmt w:val="decimal"/>
       <w:pStyle w:val="Heading7"/>
-      <w:numFmt w:val="decimal"/>
       <w:lvlText w:val="%7"/>
       <w:lvlJc w:val="start"/>
       <w:pPr>
@@ -10815,8 +10803,8 @@
     </w:lvl>
     <w:lvl w:ilvl="7">
       <w:start w:val="0"/>
+      <w:numFmt w:val="decimal"/>
       <w:pStyle w:val="Heading8"/>
-      <w:numFmt w:val="decimal"/>
       <w:lvlText w:val="%8"/>
       <w:lvlJc w:val="start"/>
       <w:pPr>
@@ -10831,8 +10819,8 @@
     </w:lvl>
     <w:lvl w:ilvl="8">
       <w:start w:val="0"/>
+      <w:numFmt w:val="decimal"/>
       <w:pStyle w:val="Heading9"/>
-      <w:numFmt w:val="decimal"/>
       <w:lvlText w:val="%9"/>
       <w:lvlJc w:val="start"/>
       <w:pPr>

</xml_diff>